<commit_message>
bổ sung lab 7 và cập nhật readme
</commit_message>
<xml_diff>
--- a/LAB7/11_ĐH_CNPM2-LAB7_1150080113-ChauThiNgocQuyen.docx
+++ b/LAB7/11_ĐH_CNPM2-LAB7_1150080113-ChauThiNgocQuyen.docx
@@ -71,15 +71,6 @@
         <w:jc w:val="center"/>
         <w:rPr>
           <w:rFonts w:hint="default" w:cs="Times New Roman"/>
-          <w:b/>
-          <w:color w:val="17365D"/>
-          <w:sz w:val="44"/>
-          <w:lang w:val="en-US"/>
-        </w:rPr>
-      </w:pPr>
-      <w:r>
-        <w:rPr>
-          <w:rFonts w:hint="default" w:cs="Times New Roman"/>
           <w:b w:val="0"/>
           <w:bCs/>
           <w:color w:val="17365D"/>
@@ -87,8 +78,7 @@
           <w:szCs w:val="28"/>
           <w:lang w:val="en-US"/>
         </w:rPr>
-        <w:t xml:space="preserve">Video - </w:t>
-      </w:r>
+      </w:pPr>
       <w:r>
         <w:rPr>
           <w:rFonts w:hint="default" w:cs="Times New Roman"/>
@@ -99,7 +89,7 @@
           <w:szCs w:val="28"/>
           <w:lang w:val="en-US"/>
         </w:rPr>
-        <w:fldChar w:fldCharType="begin"/>
+        <w:t xml:space="preserve">Video - </w:t>
       </w:r>
       <w:r>
         <w:rPr>
@@ -111,7 +101,7 @@
           <w:szCs w:val="28"/>
           <w:lang w:val="en-US"/>
         </w:rPr>
-        <w:instrText xml:space="preserve"> HYPERLINK "https://youtu.be/3UB6G5gjFqo" </w:instrText>
+        <w:fldChar w:fldCharType="begin"/>
       </w:r>
       <w:r>
         <w:rPr>
@@ -123,6 +113,18 @@
           <w:szCs w:val="28"/>
           <w:lang w:val="en-US"/>
         </w:rPr>
+        <w:instrText xml:space="preserve"> HYPERLINK "https://youtu.be/3UB6G5gjFqo" </w:instrText>
+      </w:r>
+      <w:r>
+        <w:rPr>
+          <w:rFonts w:hint="default" w:cs="Times New Roman"/>
+          <w:b w:val="0"/>
+          <w:bCs/>
+          <w:color w:val="17365D"/>
+          <w:sz w:val="28"/>
+          <w:szCs w:val="28"/>
+          <w:lang w:val="en-US"/>
+        </w:rPr>
         <w:fldChar w:fldCharType="separate"/>
       </w:r>
       <w:r>
@@ -156,12 +158,116 @@
         <w:jc w:val="center"/>
         <w:rPr>
           <w:rFonts w:hint="default" w:cs="Times New Roman"/>
+          <w:b w:val="0"/>
+          <w:bCs/>
+          <w:color w:val="17365D"/>
+          <w:sz w:val="28"/>
+          <w:szCs w:val="28"/>
+          <w:lang w:val="en-US"/>
+        </w:rPr>
+      </w:pPr>
+      <w:r>
+        <w:rPr>
+          <w:rFonts w:hint="default" w:cs="Times New Roman"/>
+          <w:b w:val="0"/>
+          <w:bCs/>
+          <w:color w:val="17365D"/>
+          <w:sz w:val="28"/>
+          <w:szCs w:val="28"/>
+          <w:lang w:val="en-US"/>
+        </w:rPr>
+        <w:t xml:space="preserve">Video bổ sung - </w:t>
+      </w:r>
+      <w:r>
+        <w:rPr>
+          <w:rFonts w:hint="default" w:cs="Times New Roman"/>
+          <w:b w:val="0"/>
+          <w:bCs/>
+          <w:color w:val="17365D"/>
+          <w:sz w:val="28"/>
+          <w:szCs w:val="28"/>
+          <w:lang w:val="en-US"/>
+        </w:rPr>
+        <w:fldChar w:fldCharType="begin"/>
+      </w:r>
+      <w:r>
+        <w:rPr>
+          <w:rFonts w:hint="default" w:cs="Times New Roman"/>
+          <w:b w:val="0"/>
+          <w:bCs/>
+          <w:color w:val="17365D"/>
+          <w:sz w:val="28"/>
+          <w:szCs w:val="28"/>
+          <w:lang w:val="en-US"/>
+        </w:rPr>
+        <w:instrText xml:space="preserve"> HYPERLINK "https://youtu.be/Y6PFrUECnhQ" </w:instrText>
+      </w:r>
+      <w:r>
+        <w:rPr>
+          <w:rFonts w:hint="default" w:cs="Times New Roman"/>
+          <w:b w:val="0"/>
+          <w:bCs/>
+          <w:color w:val="17365D"/>
+          <w:sz w:val="28"/>
+          <w:szCs w:val="28"/>
+          <w:lang w:val="en-US"/>
+        </w:rPr>
+        <w:fldChar w:fldCharType="separate"/>
+      </w:r>
+      <w:r>
+        <w:rPr>
+          <w:rStyle w:val="4"/>
+          <w:rFonts w:hint="default" w:cs="Times New Roman"/>
+          <w:b w:val="0"/>
+          <w:bCs/>
+          <w:sz w:val="28"/>
+          <w:szCs w:val="28"/>
+          <w:lang w:val="en-US"/>
+        </w:rPr>
+        <w:t>https://youtu.be/Y6PFrUECnhQ</w:t>
+      </w:r>
+      <w:r>
+        <w:rPr>
+          <w:rFonts w:hint="default" w:cs="Times New Roman"/>
+          <w:b w:val="0"/>
+          <w:bCs/>
+          <w:color w:val="17365D"/>
+          <w:sz w:val="28"/>
+          <w:szCs w:val="28"/>
+          <w:lang w:val="en-US"/>
+        </w:rPr>
+        <w:fldChar w:fldCharType="end"/>
+      </w:r>
+    </w:p>
+    <w:p>
+      <w:pPr>
+        <w:spacing w:after="160"/>
+        <w:jc w:val="center"/>
+        <w:rPr>
+          <w:rFonts w:hint="default" w:cs="Times New Roman"/>
+          <w:b w:val="0"/>
+          <w:bCs/>
+          <w:color w:val="17365D"/>
+          <w:sz w:val="28"/>
+          <w:szCs w:val="28"/>
+          <w:lang w:val="en-US"/>
+        </w:rPr>
+      </w:pPr>
+    </w:p>
+    <w:p>
+      <w:pPr>
+        <w:spacing w:after="160"/>
+        <w:jc w:val="center"/>
+        <w:rPr>
+          <w:rFonts w:hint="default" w:cs="Times New Roman"/>
           <w:b/>
           <w:color w:val="17365D"/>
           <w:sz w:val="44"/>
           <w:lang w:val="en-US"/>
         </w:rPr>
       </w:pPr>
+      <w:bookmarkStart w:id="0" w:name="_GoBack"/>
+      <w:bookmarkEnd w:id="0"/>
     </w:p>
     <w:p>
       <w:pPr>
@@ -219,21 +325,7 @@
           <w:szCs w:val="26"/>
           <w:lang w:val="en-US"/>
         </w:rPr>
-        <w:t>pfSense: Đóng vai trò trung tâm Fire</w:t>
-      </w:r>
-      <w:bookmarkStart w:id="0" w:name="_GoBack"/>
-      <w:bookmarkEnd w:id="0"/>
-      <w:r>
-        <w:rPr>
-          <w:rFonts w:hint="default" w:ascii="Times New Roman" w:hAnsi="Times New Roman" w:cs="Times New Roman"/>
-          <w:b w:val="0"/>
-          <w:bCs/>
-          <w:color w:val="17365D"/>
-          <w:sz w:val="26"/>
-          <w:szCs w:val="26"/>
-          <w:lang w:val="en-US"/>
-        </w:rPr>
-        <w:t xml:space="preserve">wall/Gateway.   </w:t>
+        <w:t xml:space="preserve">pfSense: Đóng vai trò trung tâm Firewall/Gateway.   </w:t>
       </w:r>
     </w:p>
     <w:p>
@@ -504,9 +596,9 @@
       <w:r>
         <w:drawing>
           <wp:inline distT="0" distB="0" distL="114300" distR="114300">
-            <wp:extent cx="5272405" cy="3340100"/>
-            <wp:effectExtent l="0" t="0" r="635" b="12700"/>
-            <wp:docPr id="4" name="Picture 4"/>
+            <wp:extent cx="5273040" cy="3187700"/>
+            <wp:effectExtent l="0" t="0" r="0" b="12700"/>
+            <wp:docPr id="2" name="Picture 1"/>
             <wp:cNvGraphicFramePr>
               <a:graphicFrameLocks xmlns:a="http://schemas.openxmlformats.org/drawingml/2006/main" noChangeAspect="1"/>
             </wp:cNvGraphicFramePr>
@@ -514,7 +606,7 @@
               <a:graphicData uri="http://schemas.openxmlformats.org/drawingml/2006/picture">
                 <pic:pic xmlns:pic="http://schemas.openxmlformats.org/drawingml/2006/picture">
                   <pic:nvPicPr>
-                    <pic:cNvPr id="4" name="Picture 4"/>
+                    <pic:cNvPr id="2" name="Picture 1"/>
                     <pic:cNvPicPr>
                       <a:picLocks noChangeAspect="1"/>
                     </pic:cNvPicPr>
@@ -528,7 +620,604 @@
                   <pic:spPr>
                     <a:xfrm>
                       <a:off x="0" y="0"/>
-                      <a:ext cx="5272405" cy="3340100"/>
+                      <a:ext cx="5273040" cy="3187700"/>
+                    </a:xfrm>
+                    <a:prstGeom prst="rect">
+                      <a:avLst/>
+                    </a:prstGeom>
+                    <a:noFill/>
+                    <a:ln>
+                      <a:noFill/>
+                    </a:ln>
+                  </pic:spPr>
+                </pic:pic>
+              </a:graphicData>
+            </a:graphic>
+          </wp:inline>
+        </w:drawing>
+      </w:r>
+    </w:p>
+    <w:p>
+      <w:pPr>
+        <w:numPr>
+          <w:ilvl w:val="0"/>
+          <w:numId w:val="0"/>
+        </w:numPr>
+        <w:spacing w:after="160"/>
+        <w:ind w:leftChars="0"/>
+        <w:jc w:val="both"/>
+        <w:rPr>
+          <w:rFonts w:hint="default"/>
+          <w:lang w:val="en-US"/>
+        </w:rPr>
+      </w:pPr>
+      <w:r>
+        <w:rPr>
+          <w:rFonts w:hint="default"/>
+          <w:lang w:val="en-US"/>
+        </w:rPr>
+        <w:t>Cấu hình trên pfsense web</w:t>
+      </w:r>
+    </w:p>
+    <w:p>
+      <w:pPr>
+        <w:numPr>
+          <w:ilvl w:val="0"/>
+          <w:numId w:val="0"/>
+        </w:numPr>
+        <w:spacing w:after="160"/>
+        <w:ind w:leftChars="0"/>
+        <w:jc w:val="both"/>
+      </w:pPr>
+      <w:r>
+        <w:drawing>
+          <wp:inline distT="0" distB="0" distL="114300" distR="114300">
+            <wp:extent cx="5266055" cy="2292350"/>
+            <wp:effectExtent l="0" t="0" r="6985" b="8890"/>
+            <wp:docPr id="4" name="Picture 2"/>
+            <wp:cNvGraphicFramePr>
+              <a:graphicFrameLocks xmlns:a="http://schemas.openxmlformats.org/drawingml/2006/main" noChangeAspect="1"/>
+            </wp:cNvGraphicFramePr>
+            <a:graphic xmlns:a="http://schemas.openxmlformats.org/drawingml/2006/main">
+              <a:graphicData uri="http://schemas.openxmlformats.org/drawingml/2006/picture">
+                <pic:pic xmlns:pic="http://schemas.openxmlformats.org/drawingml/2006/picture">
+                  <pic:nvPicPr>
+                    <pic:cNvPr id="4" name="Picture 2"/>
+                    <pic:cNvPicPr>
+                      <a:picLocks noChangeAspect="1"/>
+                    </pic:cNvPicPr>
+                  </pic:nvPicPr>
+                  <pic:blipFill>
+                    <a:blip r:embed="rId7"/>
+                    <a:stretch>
+                      <a:fillRect/>
+                    </a:stretch>
+                  </pic:blipFill>
+                  <pic:spPr>
+                    <a:xfrm>
+                      <a:off x="0" y="0"/>
+                      <a:ext cx="5266055" cy="2292350"/>
+                    </a:xfrm>
+                    <a:prstGeom prst="rect">
+                      <a:avLst/>
+                    </a:prstGeom>
+                    <a:noFill/>
+                    <a:ln>
+                      <a:noFill/>
+                    </a:ln>
+                  </pic:spPr>
+                </pic:pic>
+              </a:graphicData>
+            </a:graphic>
+          </wp:inline>
+        </w:drawing>
+      </w:r>
+    </w:p>
+    <w:p>
+      <w:pPr>
+        <w:numPr>
+          <w:ilvl w:val="0"/>
+          <w:numId w:val="0"/>
+        </w:numPr>
+        <w:spacing w:after="160"/>
+        <w:ind w:leftChars="0"/>
+        <w:jc w:val="both"/>
+      </w:pPr>
+      <w:r>
+        <w:drawing>
+          <wp:inline distT="0" distB="0" distL="114300" distR="114300">
+            <wp:extent cx="5266055" cy="1978025"/>
+            <wp:effectExtent l="0" t="0" r="6985" b="3175"/>
+            <wp:docPr id="5" name="Picture 3"/>
+            <wp:cNvGraphicFramePr>
+              <a:graphicFrameLocks xmlns:a="http://schemas.openxmlformats.org/drawingml/2006/main" noChangeAspect="1"/>
+            </wp:cNvGraphicFramePr>
+            <a:graphic xmlns:a="http://schemas.openxmlformats.org/drawingml/2006/main">
+              <a:graphicData uri="http://schemas.openxmlformats.org/drawingml/2006/picture">
+                <pic:pic xmlns:pic="http://schemas.openxmlformats.org/drawingml/2006/picture">
+                  <pic:nvPicPr>
+                    <pic:cNvPr id="5" name="Picture 3"/>
+                    <pic:cNvPicPr>
+                      <a:picLocks noChangeAspect="1"/>
+                    </pic:cNvPicPr>
+                  </pic:nvPicPr>
+                  <pic:blipFill>
+                    <a:blip r:embed="rId8"/>
+                    <a:stretch>
+                      <a:fillRect/>
+                    </a:stretch>
+                  </pic:blipFill>
+                  <pic:spPr>
+                    <a:xfrm>
+                      <a:off x="0" y="0"/>
+                      <a:ext cx="5266055" cy="1978025"/>
+                    </a:xfrm>
+                    <a:prstGeom prst="rect">
+                      <a:avLst/>
+                    </a:prstGeom>
+                    <a:noFill/>
+                    <a:ln>
+                      <a:noFill/>
+                    </a:ln>
+                  </pic:spPr>
+                </pic:pic>
+              </a:graphicData>
+            </a:graphic>
+          </wp:inline>
+        </w:drawing>
+      </w:r>
+    </w:p>
+    <w:p>
+      <w:pPr>
+        <w:numPr>
+          <w:ilvl w:val="0"/>
+          <w:numId w:val="0"/>
+        </w:numPr>
+        <w:spacing w:after="160"/>
+        <w:ind w:leftChars="0"/>
+        <w:jc w:val="both"/>
+      </w:pPr>
+      <w:r>
+        <w:drawing>
+          <wp:inline distT="0" distB="0" distL="114300" distR="114300">
+            <wp:extent cx="5271135" cy="2476500"/>
+            <wp:effectExtent l="0" t="0" r="1905" b="7620"/>
+            <wp:docPr id="6" name="Picture 4"/>
+            <wp:cNvGraphicFramePr>
+              <a:graphicFrameLocks xmlns:a="http://schemas.openxmlformats.org/drawingml/2006/main" noChangeAspect="1"/>
+            </wp:cNvGraphicFramePr>
+            <a:graphic xmlns:a="http://schemas.openxmlformats.org/drawingml/2006/main">
+              <a:graphicData uri="http://schemas.openxmlformats.org/drawingml/2006/picture">
+                <pic:pic xmlns:pic="http://schemas.openxmlformats.org/drawingml/2006/picture">
+                  <pic:nvPicPr>
+                    <pic:cNvPr id="6" name="Picture 4"/>
+                    <pic:cNvPicPr>
+                      <a:picLocks noChangeAspect="1"/>
+                    </pic:cNvPicPr>
+                  </pic:nvPicPr>
+                  <pic:blipFill>
+                    <a:blip r:embed="rId9"/>
+                    <a:stretch>
+                      <a:fillRect/>
+                    </a:stretch>
+                  </pic:blipFill>
+                  <pic:spPr>
+                    <a:xfrm>
+                      <a:off x="0" y="0"/>
+                      <a:ext cx="5271135" cy="2476500"/>
+                    </a:xfrm>
+                    <a:prstGeom prst="rect">
+                      <a:avLst/>
+                    </a:prstGeom>
+                    <a:noFill/>
+                    <a:ln>
+                      <a:noFill/>
+                    </a:ln>
+                  </pic:spPr>
+                </pic:pic>
+              </a:graphicData>
+            </a:graphic>
+          </wp:inline>
+        </w:drawing>
+      </w:r>
+    </w:p>
+    <w:p>
+      <w:pPr>
+        <w:numPr>
+          <w:ilvl w:val="0"/>
+          <w:numId w:val="0"/>
+        </w:numPr>
+        <w:spacing w:after="160"/>
+        <w:ind w:leftChars="0"/>
+        <w:jc w:val="both"/>
+      </w:pPr>
+      <w:r>
+        <w:drawing>
+          <wp:inline distT="0" distB="0" distL="114300" distR="114300">
+            <wp:extent cx="5271135" cy="3049905"/>
+            <wp:effectExtent l="0" t="0" r="1905" b="13335"/>
+            <wp:docPr id="7" name="Picture 5"/>
+            <wp:cNvGraphicFramePr>
+              <a:graphicFrameLocks xmlns:a="http://schemas.openxmlformats.org/drawingml/2006/main" noChangeAspect="1"/>
+            </wp:cNvGraphicFramePr>
+            <a:graphic xmlns:a="http://schemas.openxmlformats.org/drawingml/2006/main">
+              <a:graphicData uri="http://schemas.openxmlformats.org/drawingml/2006/picture">
+                <pic:pic xmlns:pic="http://schemas.openxmlformats.org/drawingml/2006/picture">
+                  <pic:nvPicPr>
+                    <pic:cNvPr id="7" name="Picture 5"/>
+                    <pic:cNvPicPr>
+                      <a:picLocks noChangeAspect="1"/>
+                    </pic:cNvPicPr>
+                  </pic:nvPicPr>
+                  <pic:blipFill>
+                    <a:blip r:embed="rId10"/>
+                    <a:stretch>
+                      <a:fillRect/>
+                    </a:stretch>
+                  </pic:blipFill>
+                  <pic:spPr>
+                    <a:xfrm>
+                      <a:off x="0" y="0"/>
+                      <a:ext cx="5271135" cy="3049905"/>
+                    </a:xfrm>
+                    <a:prstGeom prst="rect">
+                      <a:avLst/>
+                    </a:prstGeom>
+                    <a:noFill/>
+                    <a:ln>
+                      <a:noFill/>
+                    </a:ln>
+                  </pic:spPr>
+                </pic:pic>
+              </a:graphicData>
+            </a:graphic>
+          </wp:inline>
+        </w:drawing>
+      </w:r>
+    </w:p>
+    <w:p>
+      <w:pPr>
+        <w:numPr>
+          <w:ilvl w:val="0"/>
+          <w:numId w:val="0"/>
+        </w:numPr>
+        <w:spacing w:after="160"/>
+        <w:ind w:leftChars="0"/>
+        <w:jc w:val="both"/>
+        <w:rPr>
+          <w:rFonts w:ascii="SimSun" w:hAnsi="SimSun" w:eastAsia="SimSun" w:cs="SimSun"/>
+          <w:sz w:val="24"/>
+          <w:szCs w:val="24"/>
+        </w:rPr>
+      </w:pPr>
+      <w:r>
+        <w:rPr>
+          <w:rFonts w:ascii="SimSun" w:hAnsi="SimSun" w:eastAsia="SimSun" w:cs="SimSun"/>
+          <w:sz w:val="24"/>
+          <w:szCs w:val="24"/>
+        </w:rPr>
+        <w:t>PHẦN 1: CẤU HÌNH HẠ TẦNG DỊCH VỤ (DC01 &amp; DMZ-WEB)</w:t>
+      </w:r>
+    </w:p>
+    <w:p>
+      <w:pPr>
+        <w:numPr>
+          <w:ilvl w:val="0"/>
+          <w:numId w:val="0"/>
+        </w:numPr>
+        <w:spacing w:after="160"/>
+        <w:ind w:leftChars="0"/>
+        <w:jc w:val="both"/>
+        <w:rPr>
+          <w:rFonts w:ascii="SimSun" w:hAnsi="SimSun" w:eastAsia="SimSun" w:cs="SimSun"/>
+          <w:sz w:val="24"/>
+          <w:szCs w:val="24"/>
+        </w:rPr>
+      </w:pPr>
+      <w:r>
+        <w:rPr>
+          <w:rFonts w:ascii="SimSun" w:hAnsi="SimSun" w:eastAsia="SimSun" w:cs="SimSun"/>
+          <w:sz w:val="24"/>
+          <w:szCs w:val="24"/>
+        </w:rPr>
+        <w:t>Bước 1: Cấu hình DNS Server trên máy DC01</w:t>
+      </w:r>
+    </w:p>
+    <w:p>
+      <w:pPr>
+        <w:numPr>
+          <w:ilvl w:val="0"/>
+          <w:numId w:val="0"/>
+        </w:numPr>
+        <w:spacing w:after="160"/>
+        <w:ind w:leftChars="0"/>
+        <w:jc w:val="both"/>
+      </w:pPr>
+      <w:r>
+        <w:drawing>
+          <wp:inline distT="0" distB="0" distL="114300" distR="114300">
+            <wp:extent cx="5273040" cy="3780155"/>
+            <wp:effectExtent l="0" t="0" r="0" b="14605"/>
+            <wp:docPr id="8" name="Picture 6"/>
+            <wp:cNvGraphicFramePr>
+              <a:graphicFrameLocks xmlns:a="http://schemas.openxmlformats.org/drawingml/2006/main" noChangeAspect="1"/>
+            </wp:cNvGraphicFramePr>
+            <a:graphic xmlns:a="http://schemas.openxmlformats.org/drawingml/2006/main">
+              <a:graphicData uri="http://schemas.openxmlformats.org/drawingml/2006/picture">
+                <pic:pic xmlns:pic="http://schemas.openxmlformats.org/drawingml/2006/picture">
+                  <pic:nvPicPr>
+                    <pic:cNvPr id="8" name="Picture 6"/>
+                    <pic:cNvPicPr>
+                      <a:picLocks noChangeAspect="1"/>
+                    </pic:cNvPicPr>
+                  </pic:nvPicPr>
+                  <pic:blipFill>
+                    <a:blip r:embed="rId11"/>
+                    <a:stretch>
+                      <a:fillRect/>
+                    </a:stretch>
+                  </pic:blipFill>
+                  <pic:spPr>
+                    <a:xfrm>
+                      <a:off x="0" y="0"/>
+                      <a:ext cx="5273040" cy="3780155"/>
+                    </a:xfrm>
+                    <a:prstGeom prst="rect">
+                      <a:avLst/>
+                    </a:prstGeom>
+                    <a:noFill/>
+                    <a:ln>
+                      <a:noFill/>
+                    </a:ln>
+                  </pic:spPr>
+                </pic:pic>
+              </a:graphicData>
+            </a:graphic>
+          </wp:inline>
+        </w:drawing>
+      </w:r>
+    </w:p>
+    <w:p>
+      <w:pPr>
+        <w:numPr>
+          <w:ilvl w:val="0"/>
+          <w:numId w:val="0"/>
+        </w:numPr>
+        <w:spacing w:after="160"/>
+        <w:ind w:leftChars="0"/>
+        <w:jc w:val="both"/>
+      </w:pPr>
+      <w:r>
+        <w:drawing>
+          <wp:inline distT="0" distB="0" distL="114300" distR="114300">
+            <wp:extent cx="4000500" cy="3444240"/>
+            <wp:effectExtent l="9525" t="9525" r="13335" b="20955"/>
+            <wp:docPr id="9" name="Picture 7"/>
+            <wp:cNvGraphicFramePr>
+              <a:graphicFrameLocks xmlns:a="http://schemas.openxmlformats.org/drawingml/2006/main" noChangeAspect="1"/>
+            </wp:cNvGraphicFramePr>
+            <a:graphic xmlns:a="http://schemas.openxmlformats.org/drawingml/2006/main">
+              <a:graphicData uri="http://schemas.openxmlformats.org/drawingml/2006/picture">
+                <pic:pic xmlns:pic="http://schemas.openxmlformats.org/drawingml/2006/picture">
+                  <pic:nvPicPr>
+                    <pic:cNvPr id="9" name="Picture 7"/>
+                    <pic:cNvPicPr>
+                      <a:picLocks noChangeAspect="1"/>
+                    </pic:cNvPicPr>
+                  </pic:nvPicPr>
+                  <pic:blipFill>
+                    <a:blip r:embed="rId12"/>
+                    <a:stretch>
+                      <a:fillRect/>
+                    </a:stretch>
+                  </pic:blipFill>
+                  <pic:spPr>
+                    <a:xfrm>
+                      <a:off x="0" y="0"/>
+                      <a:ext cx="4000500" cy="3444240"/>
+                    </a:xfrm>
+                    <a:prstGeom prst="rect">
+                      <a:avLst/>
+                    </a:prstGeom>
+                    <a:noFill/>
+                    <a:ln>
+                      <a:solidFill>
+                        <a:schemeClr val="tx1"/>
+                      </a:solidFill>
+                    </a:ln>
+                  </pic:spPr>
+                </pic:pic>
+              </a:graphicData>
+            </a:graphic>
+          </wp:inline>
+        </w:drawing>
+      </w:r>
+    </w:p>
+    <w:p>
+      <w:pPr>
+        <w:numPr>
+          <w:ilvl w:val="0"/>
+          <w:numId w:val="0"/>
+        </w:numPr>
+        <w:spacing w:after="160"/>
+        <w:ind w:leftChars="0"/>
+        <w:jc w:val="both"/>
+      </w:pPr>
+      <w:r>
+        <w:drawing>
+          <wp:inline distT="0" distB="0" distL="114300" distR="114300">
+            <wp:extent cx="5273675" cy="3738880"/>
+            <wp:effectExtent l="9525" t="9525" r="20320" b="15875"/>
+            <wp:docPr id="10" name="Picture 8"/>
+            <wp:cNvGraphicFramePr>
+              <a:graphicFrameLocks xmlns:a="http://schemas.openxmlformats.org/drawingml/2006/main" noChangeAspect="1"/>
+            </wp:cNvGraphicFramePr>
+            <a:graphic xmlns:a="http://schemas.openxmlformats.org/drawingml/2006/main">
+              <a:graphicData uri="http://schemas.openxmlformats.org/drawingml/2006/picture">
+                <pic:pic xmlns:pic="http://schemas.openxmlformats.org/drawingml/2006/picture">
+                  <pic:nvPicPr>
+                    <pic:cNvPr id="10" name="Picture 8"/>
+                    <pic:cNvPicPr>
+                      <a:picLocks noChangeAspect="1"/>
+                    </pic:cNvPicPr>
+                  </pic:nvPicPr>
+                  <pic:blipFill>
+                    <a:blip r:embed="rId13"/>
+                    <a:stretch>
+                      <a:fillRect/>
+                    </a:stretch>
+                  </pic:blipFill>
+                  <pic:spPr>
+                    <a:xfrm>
+                      <a:off x="0" y="0"/>
+                      <a:ext cx="5273675" cy="3738880"/>
+                    </a:xfrm>
+                    <a:prstGeom prst="rect">
+                      <a:avLst/>
+                    </a:prstGeom>
+                    <a:noFill/>
+                    <a:ln>
+                      <a:solidFill>
+                        <a:schemeClr val="tx1"/>
+                      </a:solidFill>
+                    </a:ln>
+                  </pic:spPr>
+                </pic:pic>
+              </a:graphicData>
+            </a:graphic>
+          </wp:inline>
+        </w:drawing>
+      </w:r>
+    </w:p>
+    <w:p>
+      <w:pPr>
+        <w:numPr>
+          <w:ilvl w:val="0"/>
+          <w:numId w:val="0"/>
+        </w:numPr>
+        <w:spacing w:after="160"/>
+        <w:ind w:leftChars="0"/>
+        <w:jc w:val="both"/>
+      </w:pPr>
+      <w:r>
+        <w:drawing>
+          <wp:inline distT="0" distB="0" distL="114300" distR="114300">
+            <wp:extent cx="5267960" cy="5248910"/>
+            <wp:effectExtent l="0" t="0" r="5080" b="8890"/>
+            <wp:docPr id="11" name="Picture 9"/>
+            <wp:cNvGraphicFramePr>
+              <a:graphicFrameLocks xmlns:a="http://schemas.openxmlformats.org/drawingml/2006/main" noChangeAspect="1"/>
+            </wp:cNvGraphicFramePr>
+            <a:graphic xmlns:a="http://schemas.openxmlformats.org/drawingml/2006/main">
+              <a:graphicData uri="http://schemas.openxmlformats.org/drawingml/2006/picture">
+                <pic:pic xmlns:pic="http://schemas.openxmlformats.org/drawingml/2006/picture">
+                  <pic:nvPicPr>
+                    <pic:cNvPr id="11" name="Picture 9"/>
+                    <pic:cNvPicPr>
+                      <a:picLocks noChangeAspect="1"/>
+                    </pic:cNvPicPr>
+                  </pic:nvPicPr>
+                  <pic:blipFill>
+                    <a:blip r:embed="rId14"/>
+                    <a:stretch>
+                      <a:fillRect/>
+                    </a:stretch>
+                  </pic:blipFill>
+                  <pic:spPr>
+                    <a:xfrm>
+                      <a:off x="0" y="0"/>
+                      <a:ext cx="5267960" cy="5248910"/>
+                    </a:xfrm>
+                    <a:prstGeom prst="rect">
+                      <a:avLst/>
+                    </a:prstGeom>
+                    <a:noFill/>
+                    <a:ln>
+                      <a:noFill/>
+                    </a:ln>
+                  </pic:spPr>
+                </pic:pic>
+              </a:graphicData>
+            </a:graphic>
+          </wp:inline>
+        </w:drawing>
+      </w:r>
+    </w:p>
+    <w:p>
+      <w:pPr>
+        <w:numPr>
+          <w:ilvl w:val="0"/>
+          <w:numId w:val="0"/>
+        </w:numPr>
+        <w:spacing w:after="160"/>
+        <w:ind w:leftChars="0"/>
+        <w:jc w:val="both"/>
+        <w:rPr>
+          <w:rFonts w:hint="default"/>
+          <w:lang w:val="en-US"/>
+        </w:rPr>
+      </w:pPr>
+      <w:r>
+        <w:rPr>
+          <w:rFonts w:hint="default"/>
+          <w:lang w:val="en-US"/>
+        </w:rPr>
+        <w:t>Cấu hình DMZ_WEB</w:t>
+      </w:r>
+    </w:p>
+    <w:p>
+      <w:pPr>
+        <w:numPr>
+          <w:ilvl w:val="0"/>
+          <w:numId w:val="0"/>
+        </w:numPr>
+        <w:spacing w:after="160"/>
+        <w:ind w:leftChars="0"/>
+        <w:jc w:val="both"/>
+        <w:rPr>
+          <w:rFonts w:hint="default"/>
+          <w:lang w:val="en-US"/>
+        </w:rPr>
+      </w:pPr>
+    </w:p>
+    <w:p>
+      <w:pPr>
+        <w:numPr>
+          <w:ilvl w:val="0"/>
+          <w:numId w:val="0"/>
+        </w:numPr>
+        <w:spacing w:after="160"/>
+        <w:ind w:leftChars="0"/>
+        <w:jc w:val="both"/>
+      </w:pPr>
+      <w:r>
+        <w:drawing>
+          <wp:inline distT="0" distB="0" distL="114300" distR="114300">
+            <wp:extent cx="5196840" cy="5623560"/>
+            <wp:effectExtent l="0" t="0" r="0" b="0"/>
+            <wp:docPr id="12" name="Picture 10"/>
+            <wp:cNvGraphicFramePr>
+              <a:graphicFrameLocks xmlns:a="http://schemas.openxmlformats.org/drawingml/2006/main" noChangeAspect="1"/>
+            </wp:cNvGraphicFramePr>
+            <a:graphic xmlns:a="http://schemas.openxmlformats.org/drawingml/2006/main">
+              <a:graphicData uri="http://schemas.openxmlformats.org/drawingml/2006/picture">
+                <pic:pic xmlns:pic="http://schemas.openxmlformats.org/drawingml/2006/picture">
+                  <pic:nvPicPr>
+                    <pic:cNvPr id="12" name="Picture 10"/>
+                    <pic:cNvPicPr>
+                      <a:picLocks noChangeAspect="1"/>
+                    </pic:cNvPicPr>
+                  </pic:nvPicPr>
+                  <pic:blipFill>
+                    <a:blip r:embed="rId15"/>
+                    <a:stretch>
+                      <a:fillRect/>
+                    </a:stretch>
+                  </pic:blipFill>
+                  <pic:spPr>
+                    <a:xfrm>
+                      <a:off x="0" y="0"/>
+                      <a:ext cx="5196840" cy="5623560"/>
                     </a:xfrm>
                     <a:prstGeom prst="rect">
                       <a:avLst/>
@@ -611,7 +1300,7 @@
   <w:docDefaults>
     <w:rPrDefault>
       <w:rPr>
-        <w:rFonts w:asciiTheme="minorHAnsi" w:hAnsiTheme="minorHAnsi" w:eastAsiaTheme="minorEastAsia" w:cstheme="minorBidi"/>
+        <w:rFonts w:ascii="Times New Roman" w:hAnsi="Times New Roman" w:eastAsia="SimSun" w:cs="Times New Roman"/>
       </w:rPr>
     </w:rPrDefault>
     <w:pPrDefault/>
@@ -702,7 +1391,7 @@
     <w:lsdException w:unhideWhenUsed="0" w:uiPriority="0" w:semiHidden="0" w:name="Body Text Indent 2"/>
     <w:lsdException w:unhideWhenUsed="0" w:uiPriority="0" w:semiHidden="0" w:name="Body Text Indent 3"/>
     <w:lsdException w:unhideWhenUsed="0" w:uiPriority="0" w:semiHidden="0" w:name="Block Text"/>
-    <w:lsdException w:unhideWhenUsed="0" w:uiPriority="0" w:semiHidden="0" w:name="Hyperlink"/>
+    <w:lsdException w:qFormat="1" w:unhideWhenUsed="0" w:uiPriority="0" w:semiHidden="0" w:name="Hyperlink"/>
     <w:lsdException w:unhideWhenUsed="0" w:uiPriority="0" w:semiHidden="0" w:name="FollowedHyperlink"/>
     <w:lsdException w:qFormat="1" w:unhideWhenUsed="0" w:uiPriority="0" w:semiHidden="0" w:name="Strong"/>
     <w:lsdException w:qFormat="1" w:unhideWhenUsed="0" w:uiPriority="0" w:semiHidden="0" w:name="Emphasis"/>
@@ -898,6 +1587,7 @@
   <w:style w:type="character" w:styleId="4">
     <w:name w:val="Hyperlink"/>
     <w:basedOn w:val="2"/>
+    <w:qFormat/>
     <w:uiPriority w:val="0"/>
     <w:rPr>
       <w:color w:val="0000FF"/>

</xml_diff>